<commit_message>
perbaikan UI: dekripsi hanya tampilkan 2 pilihan (teks normal & file txt)
</commit_message>
<xml_diff>
--- a/Project 1/DOKUMENTASI APLIKASI PENYANDIAN DATA DIGITAL.docx
+++ b/Project 1/DOKUMENTASI APLIKASI PENYANDIAN DATA DIGITAL.docx
@@ -380,8 +380,27 @@
     </w:p>
     <w:p>
       <w:pPr>
+        <w:pStyle w:val="Heading2"/>
+      </w:pPr>
+      <w:r>
+        <w:t xml:space="preserve">Cara </w:t>
+      </w:r>
+      <w:proofErr w:type="spellStart"/>
+      <w:r>
+        <w:t>Kerja</w:t>
+      </w:r>
+      <w:proofErr w:type="spellEnd"/>
+      <w:r>
+        <w:t xml:space="preserve"> Aplikasi</w:t>
+      </w:r>
+    </w:p>
+    <w:p>
+      <w:pPr>
         <w:ind w:left="720"/>
       </w:pPr>
+      <w:r>
+        <w:t>…</w:t>
+      </w:r>
     </w:p>
     <w:p>
       <w:pPr>
@@ -449,11 +468,21 @@
       <w:pPr>
         <w:pStyle w:val="Heading2"/>
       </w:pPr>
-      <w:r>
-        <w:t xml:space="preserve">Custom Feistel </w:t>
-      </w:r>
-      <w:r>
-        <w:t>Network</w:t>
+      <w:proofErr w:type="spellStart"/>
+      <w:r>
+        <w:t>Modifikasi</w:t>
+      </w:r>
+      <w:proofErr w:type="spellEnd"/>
+      <w:r>
+        <w:t xml:space="preserve"> </w:t>
+      </w:r>
+      <w:proofErr w:type="spellStart"/>
+      <w:r>
+        <w:t>Jaringan</w:t>
+      </w:r>
+      <w:proofErr w:type="spellEnd"/>
+      <w:r>
+        <w:t xml:space="preserve"> Feistel</w:t>
       </w:r>
     </w:p>
     <w:p>
@@ -513,8 +542,13 @@
       <w:pPr>
         <w:pStyle w:val="Heading2"/>
       </w:pPr>
-      <w:r>
-        <w:t>Key Schedule</w:t>
+      <w:proofErr w:type="spellStart"/>
+      <w:r>
+        <w:t>Kunci</w:t>
+      </w:r>
+      <w:proofErr w:type="spellEnd"/>
+      <w:r>
+        <w:t xml:space="preserve"> Rahasia</w:t>
       </w:r>
     </w:p>
     <w:p>
@@ -661,11 +695,14 @@
       <w:r>
         <w:t xml:space="preserve"> </w:t>
       </w:r>
-      <w:proofErr w:type="gramStart"/>
-      <w:r>
-        <w:t>Multi-Format</w:t>
-      </w:r>
-      <w:proofErr w:type="gramEnd"/>
+      <w:proofErr w:type="spellStart"/>
+      <w:r>
+        <w:t>Berbagai</w:t>
+      </w:r>
+      <w:proofErr w:type="spellEnd"/>
+      <w:r>
+        <w:t xml:space="preserve"> Format</w:t>
+      </w:r>
     </w:p>
     <w:p>
       <w:pPr>
@@ -679,8 +716,13 @@
       <w:pPr>
         <w:pStyle w:val="Heading2"/>
       </w:pPr>
-      <w:r>
-        <w:t>Stateless Cryptography</w:t>
+      <w:proofErr w:type="spellStart"/>
+      <w:r>
+        <w:t>Pencegahan</w:t>
+      </w:r>
+      <w:proofErr w:type="spellEnd"/>
+      <w:r>
+        <w:t xml:space="preserve"> Cache Browser</w:t>
       </w:r>
     </w:p>
     <w:p>
@@ -695,9 +737,19 @@
       <w:pPr>
         <w:pStyle w:val="Heading2"/>
       </w:pPr>
-      <w:r>
-        <w:t>Generic Error Handling (Anti-Oracle Attack)</w:t>
-      </w:r>
+      <w:proofErr w:type="spellStart"/>
+      <w:r>
+        <w:t>Penanganan</w:t>
+      </w:r>
+      <w:proofErr w:type="spellEnd"/>
+      <w:r>
+        <w:t xml:space="preserve"> Error </w:t>
+      </w:r>
+      <w:proofErr w:type="spellStart"/>
+      <w:r>
+        <w:t>Generik</w:t>
+      </w:r>
+      <w:proofErr w:type="spellEnd"/>
     </w:p>
     <w:p>
       <w:pPr>
@@ -707,11 +759,38 @@
         <w:t>…</w:t>
       </w:r>
     </w:p>
-    <w:p/>
-    <w:p/>
-    <w:p/>
-    <w:p/>
-    <w:p/>
+    <w:p>
+      <w:pPr>
+        <w:pStyle w:val="Heading2"/>
+      </w:pPr>
+      <w:r>
+        <w:t>Batasan Memori</w:t>
+      </w:r>
+    </w:p>
+    <w:p>
+      <w:pPr>
+        <w:ind w:left="720"/>
+      </w:pPr>
+      <w:r>
+        <w:t>…</w:t>
+      </w:r>
+    </w:p>
+    <w:p>
+      <w:pPr>
+        <w:pStyle w:val="Heading2"/>
+      </w:pPr>
+      <w:r>
+        <w:t>Fitur Upload &amp; Download</w:t>
+      </w:r>
+    </w:p>
+    <w:p>
+      <w:pPr>
+        <w:ind w:left="720"/>
+      </w:pPr>
+      <w:r>
+        <w:t>…</w:t>
+      </w:r>
+    </w:p>
     <w:p/>
     <w:p/>
     <w:p/>
@@ -734,7 +813,7 @@
       </w:pPr>
       <w:r>
         <w:lastRenderedPageBreak/>
-        <w:t>PANDUAN PENGGUNAAN (USER MANUAL)</w:t>
+        <w:t>PANDUAN PENGGUNAAN</w:t>
       </w:r>
     </w:p>
     <w:p/>

</xml_diff>